<commit_message>
Resume: Information Security Analyst (Security Automation & Endpoint Security) @ Burns & McDonnell India (mid-tier)
</commit_message>
<xml_diff>
--- a/resumes/Resume_Information_Security_Analyst__Secur_Burns___McDonnell_India__mid-tier_.docx
+++ b/resumes/Resume_Information_Security_Analyst__Secur_Burns___McDonnell_India__mid-tier_.docx
@@ -413,7 +413,7 @@
           <w:sz w:val="19"/>
           <w:szCs w:val="19"/>
         </w:rPr>
-        <w:t>Triaged 50+ weekly inventory reimbursement cases by severity and policy eligibility, adhering to structured alert triage and escalation workflow used in SOC Tier 1 analyst roles.</w:t>
+        <w:t>Triaged 50+ weekly inventory reimbursement cases by severity and policy eligibility, prioritizing anomaly signals and escalating findings to senior reviewers.</w:t>
       </w:r>
     </w:p>
     <w:p>
@@ -432,7 +432,7 @@
           <w:sz w:val="19"/>
           <w:szCs w:val="19"/>
         </w:rPr>
-        <w:t>Conducted root cause analysis on seller claims, identifying policy violations and anomalous patterns, and escalated findings to senior reviewers.</w:t>
+        <w:t>Analyzed seller claims, identifying policy violations and anomalous patterns, and maintained audit-ready case documentation recording investigation findings and corrective actions.</w:t>
       </w:r>
     </w:p>
     <w:p>
@@ -451,7 +451,7 @@
           <w:sz w:val="19"/>
           <w:szCs w:val="19"/>
         </w:rPr>
-        <w:t>Maintained audit-ready case documentation, recording investigation findings, decisions, and corrective actions, ensuring evidence chain-of-custody discipline for security incident reporting.</w:t>
+        <w:t>Spotted recurring fraud patterns across 200+ weekly cases and flagged them early, reducing repeat-issue investigation time and improving compliance.</w:t>
       </w:r>
     </w:p>
     <w:p>
@@ -470,7 +470,7 @@
           <w:sz w:val="19"/>
           <w:szCs w:val="19"/>
         </w:rPr>
-        <w:t>Spotted recurring fraud patterns across 200+ weekly cases and flagged them early — cutting repeat-issue investigation time.</w:t>
+        <w:t>Documented investigation findings, decisions, evidence notes, and corrective actions for audit-ready case records, ensuring thorough risk management and vulnerability management.</w:t>
       </w:r>
       <w:r>
         <w:rPr>
@@ -586,7 +586,7 @@
           <w:sz w:val="19"/>
           <w:szCs w:val="19"/>
         </w:rPr>
-        <w:t>Deployed Splunk SIEM with SPL searches for brute-force detection, lateral movement, and privilege escalation; mapped TTPs to MITRE ATT&amp;CK (T1110, T1078, T1059) and wrote incident report.</w:t>
+        <w:t>Deployed Splunk SIEM with SPL searches for brute-force, lateral movement, and privilege escalation; mapped TTPs to MITRE ATT&amp;CK (T1110, T1078, T1059) and wrote incident report.</w:t>
       </w:r>
     </w:p>
     <w:p>
@@ -694,7 +694,7 @@
           <w:sz w:val="19"/>
           <w:szCs w:val="19"/>
         </w:rPr>
-        <w:t>Built multi-API threat intelligence pipeline: submits suspicious data to VirusTotal, AbuseIPDB, and URLScan.io; cross-references WHOIS, DNS, and SSL details for unified phishing score.</w:t>
+        <w:t>Built multi-API threat intelligence pipeline: submits suspicious data to VirusTotal, AbuseIPDB, and URLScan.io; cross-references WHOIS, DNS, and SSL details for unified phishing probability score.</w:t>
       </w:r>
     </w:p>
     <w:p>
@@ -713,7 +713,7 @@
           <w:sz w:val="19"/>
           <w:szCs w:val="19"/>
         </w:rPr>
-        <w:t>Developed typosquatting detector generating domain variants and checking DNS resolution to catch brand-impersonation attacks.</w:t>
+        <w:t>Implemented typosquatting domain detector generating brand domain variants and checking live DNS resolution to catch brand-impersonation attacks.</w:t>
       </w:r>
     </w:p>
     <w:p>
@@ -868,7 +868,7 @@
           <w:sz w:val="19"/>
           <w:szCs w:val="19"/>
         </w:rPr>
-        <w:t>Python, Bash (basic), regular expressions, Endpoint Security, Cloud Security, Compliance</w:t>
+        <w:t>Python, Bash (basic), regular expressions, Endpoint Security, Incident Response, Compliance</w:t>
       </w:r>
     </w:p>
     <w:p>

</xml_diff>